<commit_message>
Saudi register: policy and annex marked published within stated scope
</commit_message>
<xml_diff>
--- a/policies/saudi/downloads/Saudi_source_register.docx
+++ b/policies/saudi/downloads/Saudi_source_register.docx
@@ -2465,11 +2465,22 @@
             <w:r>
               <w:rPr>
                 <w:rFonts w:ascii="Calibri" w:cs="Calibri" w:eastAsia="Calibri" w:hAnsi="Calibri"/>
-                <w:color w:val="333A45"/>
-                <w:sz w:val="19"/>
-                <w:szCs w:val="19"/>
-              </w:rPr>
-              <w:t xml:space="preserve">Draft</w:t>
+                <w:b/>
+                <w:bCs/>
+                <w:color w:val="333A45"/>
+                <w:sz w:val="19"/>
+                <w:szCs w:val="19"/>
+              </w:rPr>
+              <w:t xml:space="preserve">Published 2 Sep 2026</w:t>
+            </w:r>
+            <w:r>
+              <w:rPr>
+                <w:rFonts w:ascii="Calibri" w:cs="Calibri" w:eastAsia="Calibri" w:hAnsi="Calibri"/>
+                <w:color w:val="333A45"/>
+                <w:sz w:val="19"/>
+                <w:szCs w:val="19"/>
+              </w:rPr>
+              <w:t xml:space="preserve"> - verified within stated scope (government data)</w:t>
             </w:r>
           </w:p>
         </w:tc>
@@ -2548,11 +2559,22 @@
             <w:r>
               <w:rPr>
                 <w:rFonts w:ascii="Calibri" w:cs="Calibri" w:eastAsia="Calibri" w:hAnsi="Calibri"/>
-                <w:color w:val="333A45"/>
-                <w:sz w:val="19"/>
-                <w:szCs w:val="19"/>
-              </w:rPr>
-              <w:t xml:space="preserve">Draft</w:t>
+                <w:b/>
+                <w:bCs/>
+                <w:color w:val="333A45"/>
+                <w:sz w:val="19"/>
+                <w:szCs w:val="19"/>
+              </w:rPr>
+              <w:t xml:space="preserve">Published 2 Sep 2026</w:t>
+            </w:r>
+            <w:r>
+              <w:rPr>
+                <w:rFonts w:ascii="Calibri" w:cs="Calibri" w:eastAsia="Calibri" w:hAnsi="Calibri"/>
+                <w:color w:val="333A45"/>
+                <w:sz w:val="19"/>
+                <w:szCs w:val="19"/>
+              </w:rPr>
+              <w:t xml:space="preserve"> - verified within stated scope (government data)</w:t>
             </w:r>
           </w:p>
         </w:tc>
@@ -2607,7 +2629,7 @@
                 <w:sz w:val="19"/>
                 <w:szCs w:val="19"/>
               </w:rPr>
-              <w:t xml:space="preserve">1.0</w:t>
+              <w:t xml:space="preserve">1.0 + addendum</w:t>
             </w:r>
           </w:p>
         </w:tc>
@@ -2632,7 +2654,7 @@
                 <w:sz w:val="19"/>
                 <w:szCs w:val="19"/>
               </w:rPr>
-              <w:t xml:space="preserve">Citations, findings, the map of the gaps</w:t>
+              <w:t xml:space="preserve">Citations, findings, the map of the gaps; 2 Sep addendum on the Implementing Regulation</w:t>
             </w:r>
           </w:p>
         </w:tc>
@@ -2689,7 +2711,7 @@
                 <w:sz w:val="19"/>
                 <w:szCs w:val="19"/>
               </w:rPr>
-              <w:t xml:space="preserve">1.0</w:t>
+              <w:t xml:space="preserve">1.1</w:t>
             </w:r>
           </w:p>
         </w:tc>

</xml_diff>